<commit_message>
Fix minor requirement statement.,
Windsurf not needed.
</commit_message>
<xml_diff>
--- a/PackagerMCP_Claude.docx
+++ b/PackagerMCP_Claude.docx
@@ -45,15 +45,7 @@
     </w:p>
     <w:p>
       <w:r>
-        <w:t xml:space="preserve">Having the MCP server </w:t>
-      </w:r>
-      <w:proofErr w:type="gramStart"/>
-      <w:r>
-        <w:t>download</w:t>
-      </w:r>
-      <w:proofErr w:type="gramEnd"/>
-      <w:r>
-        <w:t xml:space="preserve"> the latest </w:t>
+        <w:t xml:space="preserve">Having the MCP server download the latest </w:t>
       </w:r>
       <w:r>
         <w:t xml:space="preserve">PowerShell App Deployment Toolkit </w:t>
@@ -82,15 +74,7 @@
     </w:p>
     <w:p>
       <w:r>
-        <w:t xml:space="preserve">For those of you </w:t>
-      </w:r>
-      <w:proofErr w:type="spellStart"/>
-      <w:r>
-        <w:t>new</w:t>
-      </w:r>
-      <w:proofErr w:type="spellEnd"/>
-      <w:r>
-        <w:t xml:space="preserve"> to using </w:t>
+        <w:t xml:space="preserve">For those of you new to using </w:t>
       </w:r>
       <w:r>
         <w:t>the PowerShell App Deployment Toolkit, this can be a fantastic learning experience because not only do you get help packaging,</w:t>
@@ -224,52 +208,12 @@
         <w:t>,</w:t>
       </w:r>
       <w:r>
-        <w:t xml:space="preserve"> we will </w:t>
-      </w:r>
-      <w:proofErr w:type="spellStart"/>
-      <w:r>
-        <w:t>code</w:t>
-      </w:r>
-      <w:proofErr w:type="spellEnd"/>
-      <w:r>
-        <w:t xml:space="preserve"> from the command line.</w:t>
+        <w:t xml:space="preserve"> we will code from the command line.</w:t>
       </w:r>
     </w:p>
     <w:p>
       <w:r>
         <w:lastRenderedPageBreak/>
-        <w:t>Windsurf</w:t>
-      </w:r>
-      <w:r>
-        <w:t xml:space="preserve">: Using this solution requires </w:t>
-      </w:r>
-      <w:r>
-        <w:t>an</w:t>
-      </w:r>
-      <w:r>
-        <w:t xml:space="preserve"> IDE that integrates with MCP servers. I’ve </w:t>
-      </w:r>
-      <w:r>
-        <w:t>used Windsurf before, and it isn’t all that different from VS Code</w:t>
-      </w:r>
-      <w:r>
-        <w:t xml:space="preserve">. </w:t>
-      </w:r>
-      <w:r>
-        <w:t>To</w:t>
-      </w:r>
-      <w:r>
-        <w:t xml:space="preserve"> make this solution work as documented</w:t>
-      </w:r>
-      <w:r>
-        <w:t>,</w:t>
-      </w:r>
-      <w:r>
-        <w:t xml:space="preserve"> you will need to use Windsurf.</w:t>
-      </w:r>
-    </w:p>
-    <w:p>
-      <w:r>
         <w:t xml:space="preserve">GitHub: Connect to the Winget repository </w:t>
       </w:r>
       <w:r>
@@ -300,28 +244,12 @@
           <w:rStyle w:val="SubtleReference"/>
         </w:rPr>
       </w:pPr>
-      <w:proofErr w:type="spellStart"/>
       <w:r>
         <w:rPr>
           <w:rStyle w:val="SubtleReference"/>
         </w:rPr>
-        <w:t>winget</w:t>
-      </w:r>
-      <w:proofErr w:type="spellEnd"/>
-      <w:r>
-        <w:rPr>
-          <w:rStyle w:val="SubtleReference"/>
-        </w:rPr>
-        <w:t xml:space="preserve"> install </w:t>
-      </w:r>
-      <w:proofErr w:type="spellStart"/>
-      <w:r>
-        <w:rPr>
-          <w:rStyle w:val="SubtleReference"/>
-        </w:rPr>
-        <w:t>git.git</w:t>
-      </w:r>
-      <w:proofErr w:type="spellEnd"/>
+        <w:t>winget install git.git</w:t>
+      </w:r>
     </w:p>
     <w:p>
       <w:r>
@@ -500,19 +428,11 @@
           <w:rStyle w:val="SubtleReference"/>
         </w:rPr>
       </w:pPr>
-      <w:proofErr w:type="spellStart"/>
       <w:r>
         <w:rPr>
           <w:rStyle w:val="SubtleReference"/>
         </w:rPr>
-        <w:t>winget</w:t>
-      </w:r>
-      <w:proofErr w:type="spellEnd"/>
-      <w:r>
-        <w:rPr>
-          <w:rStyle w:val="SubtleReference"/>
-        </w:rPr>
-        <w:t xml:space="preserve"> install OpenJS.NodeJS.21</w:t>
+        <w:t>winget install OpenJS.NodeJS.21</w:t>
       </w:r>
     </w:p>
     <w:p>
@@ -596,20 +516,7 @@
           <w:rStyle w:val="SubtleReference"/>
         </w:rPr>
         <w:br/>
-      </w:r>
-      <w:proofErr w:type="spellStart"/>
-      <w:r>
-        <w:rPr>
-          <w:rStyle w:val="SubtleReference"/>
-        </w:rPr>
-        <w:t>mkdir</w:t>
-      </w:r>
-      <w:proofErr w:type="spellEnd"/>
-      <w:r>
-        <w:rPr>
-          <w:rStyle w:val="SubtleReference"/>
-        </w:rPr>
-        <w:t xml:space="preserve"> MCP</w:t>
+        <w:t>mkdir MCP</w:t>
       </w:r>
     </w:p>
     <w:p>
@@ -703,15 +610,7 @@
     </w:p>
     <w:p>
       <w:r>
-        <w:t xml:space="preserve">The installation of </w:t>
-      </w:r>
-      <w:proofErr w:type="gramStart"/>
-      <w:r>
-        <w:t>the MCP</w:t>
-      </w:r>
-      <w:proofErr w:type="gramEnd"/>
-      <w:r>
-        <w:t xml:space="preserve"> </w:t>
+        <w:t xml:space="preserve">The installation of the MCP </w:t>
       </w:r>
       <w:r>
         <w:t xml:space="preserve">largely involves </w:t>
@@ -948,15 +847,7 @@
         <w:t>installation of required libraries such as the MCP SDK and Zod</w:t>
       </w:r>
       <w:r>
-        <w:t xml:space="preserve">. They are not part of the </w:t>
-      </w:r>
-      <w:proofErr w:type="gramStart"/>
-      <w:r>
-        <w:t>repository</w:t>
-      </w:r>
-      <w:proofErr w:type="gramEnd"/>
-      <w:r>
-        <w:t xml:space="preserve"> so this is required for every MCP installation.</w:t>
+        <w:t>. They are not part of the repository so this is required for every MCP installation.</w:t>
       </w:r>
     </w:p>
     <w:p>
@@ -970,54 +861,24 @@
           <w:rStyle w:val="SubtleReference"/>
         </w:rPr>
       </w:pPr>
-      <w:proofErr w:type="gramStart"/>
       <w:r>
         <w:rPr>
           <w:rStyle w:val="SubtleReference"/>
         </w:rPr>
-        <w:t>cd .</w:t>
-      </w:r>
-      <w:proofErr w:type="gramEnd"/>
-      <w:r>
+        <w:t>cd .\packager-mcp\</w:t>
+      </w:r>
+    </w:p>
+    <w:p>
+      <w:pPr>
         <w:rPr>
           <w:rStyle w:val="SubtleReference"/>
         </w:rPr>
-        <w:t>\packager-</w:t>
-      </w:r>
-      <w:proofErr w:type="spellStart"/>
+      </w:pPr>
       <w:r>
         <w:rPr>
           <w:rStyle w:val="SubtleReference"/>
         </w:rPr>
-        <w:t>mcp</w:t>
-      </w:r>
-      <w:proofErr w:type="spellEnd"/>
-      <w:r>
-        <w:rPr>
-          <w:rStyle w:val="SubtleReference"/>
-        </w:rPr>
-        <w:t>\</w:t>
-      </w:r>
-    </w:p>
-    <w:p>
-      <w:pPr>
-        <w:rPr>
-          <w:rStyle w:val="SubtleReference"/>
-        </w:rPr>
-      </w:pPr>
-      <w:proofErr w:type="spellStart"/>
-      <w:r>
-        <w:rPr>
-          <w:rStyle w:val="SubtleReference"/>
-        </w:rPr>
-        <w:t>npm</w:t>
-      </w:r>
-      <w:proofErr w:type="spellEnd"/>
-      <w:r>
-        <w:rPr>
-          <w:rStyle w:val="SubtleReference"/>
-        </w:rPr>
-        <w:t xml:space="preserve"> install</w:t>
+        <w:t>npm install</w:t>
       </w:r>
     </w:p>
     <w:p>
@@ -1099,19 +960,11 @@
           <w:rStyle w:val="SubtleReference"/>
         </w:rPr>
       </w:pPr>
-      <w:proofErr w:type="spellStart"/>
       <w:r>
         <w:rPr>
           <w:rStyle w:val="SubtleReference"/>
         </w:rPr>
-        <w:t>npm</w:t>
-      </w:r>
-      <w:proofErr w:type="spellEnd"/>
-      <w:r>
-        <w:rPr>
-          <w:rStyle w:val="SubtleReference"/>
-        </w:rPr>
-        <w:t xml:space="preserve"> run build</w:t>
+        <w:t>npm run build</w:t>
       </w:r>
     </w:p>
     <w:p>
@@ -1211,31 +1064,13 @@
       </w:r>
     </w:p>
     <w:p>
-      <w:proofErr w:type="spellStart"/>
-      <w:r>
-        <w:t>irm</w:t>
-      </w:r>
-      <w:proofErr w:type="spellEnd"/>
-      <w:r>
-        <w:t xml:space="preserve"> https://claude.ai/install.ps1 | </w:t>
-      </w:r>
-      <w:proofErr w:type="spellStart"/>
-      <w:r>
-        <w:t>iex</w:t>
-      </w:r>
-      <w:proofErr w:type="spellEnd"/>
-    </w:p>
-    <w:p>
-      <w:r>
-        <w:t xml:space="preserve">The installer will give you a </w:t>
-      </w:r>
-      <w:proofErr w:type="gramStart"/>
-      <w:r>
-        <w:t>success</w:t>
-      </w:r>
-      <w:proofErr w:type="gramEnd"/>
-      <w:r>
-        <w:t xml:space="preserve"> message that can be misleading. If you look closely</w:t>
+      <w:r>
+        <w:t>irm https://claude.ai/install.ps1 | iex</w:t>
+      </w:r>
+    </w:p>
+    <w:p>
+      <w:r>
+        <w:t>The installer will give you a success message that can be misleading. If you look closely</w:t>
       </w:r>
       <w:r>
         <w:t>,</w:t>
@@ -1304,15 +1139,7 @@
         <w:t>, I provided</w:t>
       </w:r>
       <w:r>
-        <w:t xml:space="preserve"> a script in the </w:t>
-      </w:r>
-      <w:proofErr w:type="spellStart"/>
-      <w:r>
-        <w:t>Packaging_Files</w:t>
-      </w:r>
-      <w:proofErr w:type="spellEnd"/>
-      <w:r>
-        <w:t xml:space="preserve"> subfolder. Simply go to that folder and run the Set-ClaudeCLIEnv.ps1.</w:t>
+        <w:t xml:space="preserve"> a script in the Packaging_Files subfolder. Simply go to that folder and run the Set-ClaudeCLIEnv.ps1.</w:t>
       </w:r>
     </w:p>
     <w:p>
@@ -1365,15 +1192,7 @@
     </w:p>
     <w:p>
       <w:r>
-        <w:t xml:space="preserve">Close the prompt as it will need to refresh </w:t>
-      </w:r>
-      <w:proofErr w:type="gramStart"/>
-      <w:r>
-        <w:t>environment</w:t>
-      </w:r>
-      <w:proofErr w:type="gramEnd"/>
-      <w:r>
-        <w:t xml:space="preserve"> variables.</w:t>
+        <w:t>Close the prompt as it will need to refresh environment variables.</w:t>
       </w:r>
     </w:p>
     <w:p>
@@ -1880,29 +1699,8 @@
       </w:r>
     </w:p>
     <w:p>
-      <w:proofErr w:type="spellStart"/>
-      <w:r>
-        <w:t>claude</w:t>
-      </w:r>
-      <w:proofErr w:type="spellEnd"/>
-      <w:r>
-        <w:t xml:space="preserve"> </w:t>
-      </w:r>
-      <w:proofErr w:type="spellStart"/>
-      <w:r>
-        <w:t>mcp</w:t>
-      </w:r>
-      <w:proofErr w:type="spellEnd"/>
-      <w:r>
-        <w:t xml:space="preserve"> add packager-</w:t>
-      </w:r>
-      <w:proofErr w:type="spellStart"/>
-      <w:r>
-        <w:t>mcp</w:t>
-      </w:r>
-      <w:proofErr w:type="spellEnd"/>
-      <w:r>
-        <w:t xml:space="preserve"> node C:/</w:t>
+      <w:r>
+        <w:t>claude mcp add packager-mcp node C:/</w:t>
       </w:r>
       <w:r>
         <w:t>MCP</w:t>
@@ -2044,23 +1842,10 @@
     </w:p>
     <w:p>
       <w:r>
-        <w:t xml:space="preserve">Press </w:t>
-      </w:r>
-      <w:proofErr w:type="gramStart"/>
-      <w:r>
-        <w:t>enter</w:t>
-      </w:r>
-      <w:proofErr w:type="gramEnd"/>
-      <w:r>
-        <w:t xml:space="preserve"> to accept dark mode then </w:t>
-      </w:r>
-      <w:proofErr w:type="gramStart"/>
-      <w:r>
-        <w:t>select</w:t>
-      </w:r>
-      <w:proofErr w:type="gramEnd"/>
-      <w:r>
-        <w:t xml:space="preserve"> Claude account with subscription.</w:t>
+        <w:t xml:space="preserve">Press enter to accept dark mode then </w:t>
+      </w:r>
+      <w:r>
+        <w:t>select Claude account with subscription.</w:t>
       </w:r>
     </w:p>
     <w:p>
@@ -2302,15 +2087,7 @@
     </w:p>
     <w:p>
       <w:r>
-        <w:t xml:space="preserve">If you go back to </w:t>
-      </w:r>
-      <w:proofErr w:type="gramStart"/>
-      <w:r>
-        <w:t>Claude CLI</w:t>
-      </w:r>
-      <w:proofErr w:type="gramEnd"/>
-      <w:r>
-        <w:t xml:space="preserve"> it should be activated.</w:t>
+        <w:t>If you go back to Claude CLI it should be activated.</w:t>
       </w:r>
     </w:p>
     <w:p>
@@ -2432,17 +2209,7 @@
         <w:t>C</w:t>
       </w:r>
       <w:r>
-        <w:t xml:space="preserve">laude to write to </w:t>
-      </w:r>
-      <w:proofErr w:type="spellStart"/>
-      <w:proofErr w:type="gramStart"/>
-      <w:r>
-        <w:t>it’s</w:t>
-      </w:r>
-      <w:proofErr w:type="spellEnd"/>
-      <w:proofErr w:type="gramEnd"/>
-      <w:r>
-        <w:t xml:space="preserve"> configuration file.</w:t>
+        <w:t>laude to write to it’s configuration file.</w:t>
       </w:r>
     </w:p>
     <w:p>
@@ -2555,29 +2322,8 @@
       </w:r>
     </w:p>
     <w:p>
-      <w:proofErr w:type="spellStart"/>
-      <w:r>
-        <w:t>claude</w:t>
-      </w:r>
-      <w:proofErr w:type="spellEnd"/>
-      <w:r>
-        <w:t xml:space="preserve"> </w:t>
-      </w:r>
-      <w:proofErr w:type="spellStart"/>
-      <w:r>
-        <w:t>mcp</w:t>
-      </w:r>
-      <w:proofErr w:type="spellEnd"/>
-      <w:r>
-        <w:t xml:space="preserve"> add packager-</w:t>
-      </w:r>
-      <w:proofErr w:type="spellStart"/>
-      <w:r>
-        <w:t>mcp</w:t>
-      </w:r>
-      <w:proofErr w:type="spellEnd"/>
-      <w:r>
-        <w:t xml:space="preserve"> node C:/</w:t>
+      <w:r>
+        <w:t>claude mcp add packager-mcp node C:/</w:t>
       </w:r>
       <w:r>
         <w:t>MCP</w:t>
@@ -2732,15 +2478,7 @@
     </w:p>
     <w:p>
       <w:r>
-        <w:t xml:space="preserve">Read </w:t>
-      </w:r>
-      <w:proofErr w:type="gramStart"/>
-      <w:r>
-        <w:t>the @</w:t>
-      </w:r>
-      <w:proofErr w:type="gramEnd"/>
-      <w:r>
-        <w:t>Claude.md file for context</w:t>
+        <w:t>Read the @Claude.md file for context</w:t>
       </w:r>
     </w:p>
     <w:p>
@@ -2787,15 +2525,7 @@
     </w:p>
     <w:p>
       <w:r>
-        <w:t xml:space="preserve">The file will be read and stored </w:t>
-      </w:r>
-      <w:proofErr w:type="gramStart"/>
-      <w:r>
-        <w:t>to</w:t>
-      </w:r>
-      <w:proofErr w:type="gramEnd"/>
-      <w:r>
-        <w:t xml:space="preserve"> memory</w:t>
+        <w:t>The file will be read and stored to memory</w:t>
       </w:r>
       <w:r>
         <w:t>.</w:t>
@@ -3024,31 +2754,7 @@
         <w:pStyle w:val="NoSpacing"/>
       </w:pPr>
       <w:r>
-        <w:t xml:space="preserve">2. Use </w:t>
-      </w:r>
-      <w:proofErr w:type="spellStart"/>
-      <w:r>
-        <w:t>get_psadt_template</w:t>
-      </w:r>
-      <w:proofErr w:type="spellEnd"/>
-      <w:r>
-        <w:t xml:space="preserve"> </w:t>
-      </w:r>
-      <w:proofErr w:type="gramStart"/>
-      <w:r>
-        <w:t>with .</w:t>
-      </w:r>
-      <w:proofErr w:type="gramEnd"/>
-      <w:r>
-        <w:t>\</w:t>
-      </w:r>
-      <w:proofErr w:type="spellStart"/>
-      <w:r>
-        <w:t>TEST_WinRAR_Package</w:t>
-      </w:r>
-      <w:proofErr w:type="spellEnd"/>
-      <w:r>
-        <w:t xml:space="preserve"> to generate the template files</w:t>
+        <w:t>2. Use get_psadt_template with .\TEST_WinRAR_Package to generate the template files</w:t>
       </w:r>
     </w:p>
     <w:p>
@@ -3064,13 +2770,8 @@
         <w:pStyle w:val="NoSpacing"/>
       </w:pPr>
       <w:r>
-        <w:t>4. Download the installer to the Files folder using Invoke-</w:t>
-      </w:r>
-      <w:proofErr w:type="spellStart"/>
-      <w:r>
-        <w:t>WebRequest</w:t>
-      </w:r>
-      <w:proofErr w:type="spellEnd"/>
+        <w:t>4. Download the installer to the Files folder using Invoke-WebRequest</w:t>
+      </w:r>
     </w:p>
     <w:p>
       <w:pPr>
@@ -3090,13 +2791,8 @@
         <w:pStyle w:val="NoSpacing"/>
       </w:pPr>
       <w:r>
-        <w:t xml:space="preserve">Once the prompt is </w:t>
-      </w:r>
-      <w:proofErr w:type="gramStart"/>
-      <w:r>
-        <w:t>pasted</w:t>
-      </w:r>
-      <w:proofErr w:type="gramEnd"/>
+        <w:t>Once the prompt is pasted</w:t>
+      </w:r>
       <w:r>
         <w:t>,</w:t>
       </w:r>
@@ -3245,15 +2941,7 @@
         <w:t xml:space="preserve">You can </w:t>
       </w:r>
       <w:r>
-        <w:t xml:space="preserve">exit the process by pressing </w:t>
-      </w:r>
-      <w:proofErr w:type="spellStart"/>
-      <w:r>
-        <w:t>Ctrl+C</w:t>
-      </w:r>
-      <w:proofErr w:type="spellEnd"/>
-      <w:r>
-        <w:t xml:space="preserve"> twice or selecting option 3, then you can also ask Claude</w:t>
+        <w:t>exit the process by pressing Ctrl+C twice or selecting option 3, then you can also ask Claude</w:t>
       </w:r>
       <w:r>
         <w:t xml:space="preserve"> to verify the MCP installation for you.</w:t>
@@ -3475,13 +3163,8 @@
       <w:r>
         <w:t xml:space="preserve"> you can press CTL+C twice to exit and run the Invoke-PowerShellAppDeploymentToolkit.ps1 in the </w:t>
       </w:r>
-      <w:proofErr w:type="spellStart"/>
-      <w:r>
-        <w:t>WinRAR_Package</w:t>
-      </w:r>
-      <w:proofErr w:type="spellEnd"/>
-      <w:r>
-        <w:t xml:space="preserve"> folder.</w:t>
+      <w:r>
+        <w:t>WinRAR_Package folder.</w:t>
       </w:r>
       <w:r>
         <w:t xml:space="preserve"> Or you can launch an elevated PowerShell prompt to test the package.</w:t>
@@ -3519,11 +3202,9 @@
       <w:r>
         <w:t xml:space="preserve">built the MCP server, I </w:t>
       </w:r>
-      <w:proofErr w:type="spellStart"/>
       <w:r>
         <w:t>realised</w:t>
       </w:r>
-      <w:proofErr w:type="spellEnd"/>
       <w:r>
         <w:t xml:space="preserve"> the output only looked good and wasn’t usable.</w:t>
       </w:r>
@@ -3545,11 +3226,9 @@
       <w:r>
         <w:t xml:space="preserve"> I was hoping to make this simpler from an AI perspective, but the journey required me to find ways to fix the AI's </w:t>
       </w:r>
-      <w:proofErr w:type="spellStart"/>
       <w:r>
         <w:t>behaviour</w:t>
       </w:r>
-      <w:proofErr w:type="spellEnd"/>
       <w:r>
         <w:t>.</w:t>
       </w:r>
@@ -3631,455 +3310,148 @@
         <w:pStyle w:val="NoSpacing"/>
       </w:pPr>
       <w:r>
-        <w:t>| `Initialize-</w:t>
-      </w:r>
-      <w:proofErr w:type="spellStart"/>
-      <w:r>
-        <w:t>ADTDeployment</w:t>
-      </w:r>
-      <w:proofErr w:type="spellEnd"/>
-      <w:r>
-        <w:t>` | `Open-</w:t>
-      </w:r>
-      <w:proofErr w:type="spellStart"/>
-      <w:r>
-        <w:t>ADTSession</w:t>
-      </w:r>
-      <w:proofErr w:type="spellEnd"/>
-      <w:r>
-        <w:t>` |</w:t>
-      </w:r>
-    </w:p>
-    <w:p>
-      <w:pPr>
-        <w:pStyle w:val="NoSpacing"/>
-      </w:pPr>
-      <w:r>
-        <w:t>| `Complete-</w:t>
-      </w:r>
-      <w:proofErr w:type="spellStart"/>
-      <w:r>
-        <w:t>ADTDeployment</w:t>
-      </w:r>
-      <w:proofErr w:type="spellEnd"/>
-      <w:r>
-        <w:t>` | `Close-</w:t>
-      </w:r>
-      <w:proofErr w:type="spellStart"/>
-      <w:r>
-        <w:t>ADTSession</w:t>
-      </w:r>
-      <w:proofErr w:type="spellEnd"/>
-      <w:r>
-        <w:t>` |</w:t>
-      </w:r>
-    </w:p>
-    <w:p>
-      <w:pPr>
-        <w:pStyle w:val="NoSpacing"/>
-      </w:pPr>
-      <w:r>
-        <w:t>| `Get-</w:t>
-      </w:r>
-      <w:proofErr w:type="spellStart"/>
-      <w:r>
-        <w:t>ADTInstalledApplication</w:t>
-      </w:r>
-      <w:proofErr w:type="spellEnd"/>
-      <w:r>
-        <w:t>` | `Get-</w:t>
-      </w:r>
-      <w:proofErr w:type="spellStart"/>
-      <w:r>
-        <w:t>ADTApplication</w:t>
-      </w:r>
-      <w:proofErr w:type="spellEnd"/>
-      <w:r>
-        <w:t>` |</w:t>
-      </w:r>
-    </w:p>
-    <w:p>
-      <w:pPr>
-        <w:pStyle w:val="NoSpacing"/>
-      </w:pPr>
-      <w:r>
-        <w:t>| `Execute-Process` | `Start-</w:t>
-      </w:r>
-      <w:proofErr w:type="spellStart"/>
-      <w:r>
-        <w:t>ADTProcess</w:t>
-      </w:r>
-      <w:proofErr w:type="spellEnd"/>
-      <w:r>
-        <w:t>` |</w:t>
-      </w:r>
-    </w:p>
-    <w:p>
-      <w:pPr>
-        <w:pStyle w:val="NoSpacing"/>
-      </w:pPr>
-      <w:r>
-        <w:t>| `Execute-MSI` | `Start-</w:t>
-      </w:r>
-      <w:proofErr w:type="spellStart"/>
-      <w:r>
-        <w:t>ADTMsiProcess</w:t>
-      </w:r>
-      <w:proofErr w:type="spellEnd"/>
-      <w:r>
-        <w:t>` |</w:t>
-      </w:r>
-    </w:p>
-    <w:p>
-      <w:pPr>
-        <w:pStyle w:val="NoSpacing"/>
-      </w:pPr>
-      <w:r>
-        <w:t>| `Show-</w:t>
-      </w:r>
-      <w:proofErr w:type="spellStart"/>
-      <w:r>
-        <w:t>InstallationWelcome</w:t>
-      </w:r>
-      <w:proofErr w:type="spellEnd"/>
-      <w:r>
-        <w:t>` | `Show-</w:t>
-      </w:r>
-      <w:proofErr w:type="spellStart"/>
-      <w:r>
-        <w:t>ADTInstallationWelcome</w:t>
-      </w:r>
-      <w:proofErr w:type="spellEnd"/>
-      <w:r>
-        <w:t>` |</w:t>
-      </w:r>
-    </w:p>
-    <w:p>
-      <w:pPr>
-        <w:pStyle w:val="NoSpacing"/>
-      </w:pPr>
-      <w:r>
-        <w:t>| `Show-</w:t>
-      </w:r>
-      <w:proofErr w:type="spellStart"/>
-      <w:r>
-        <w:t>InstallationProgress</w:t>
-      </w:r>
-      <w:proofErr w:type="spellEnd"/>
-      <w:r>
-        <w:t>` | `Show-</w:t>
-      </w:r>
-      <w:proofErr w:type="spellStart"/>
-      <w:r>
-        <w:t>ADTInstallationProgress</w:t>
-      </w:r>
-      <w:proofErr w:type="spellEnd"/>
-      <w:r>
-        <w:t>` |</w:t>
-      </w:r>
-    </w:p>
-    <w:p>
-      <w:pPr>
-        <w:pStyle w:val="NoSpacing"/>
-      </w:pPr>
-      <w:r>
-        <w:t>| `-Arguments` parameter | `-</w:t>
-      </w:r>
-      <w:proofErr w:type="spellStart"/>
-      <w:r>
-        <w:t>ArgumentList</w:t>
-      </w:r>
-      <w:proofErr w:type="spellEnd"/>
-      <w:r>
-        <w:t>` parameter |</w:t>
-      </w:r>
-    </w:p>
-    <w:p>
-      <w:pPr>
-        <w:pStyle w:val="NoSpacing"/>
-      </w:pPr>
-      <w:r>
-        <w:t>| `Close-</w:t>
-      </w:r>
-      <w:proofErr w:type="spellStart"/>
-      <w:r>
-        <w:t>ADTSession</w:t>
-      </w:r>
-      <w:proofErr w:type="spellEnd"/>
-      <w:r>
-        <w:t xml:space="preserve"> -</w:t>
-      </w:r>
-      <w:proofErr w:type="spellStart"/>
-      <w:r>
-        <w:t>DeploymentStatus</w:t>
-      </w:r>
-      <w:proofErr w:type="spellEnd"/>
-      <w:r>
-        <w:t>` | `Close-</w:t>
-      </w:r>
-      <w:proofErr w:type="spellStart"/>
-      <w:r>
-        <w:t>ADTSession</w:t>
-      </w:r>
-      <w:proofErr w:type="spellEnd"/>
-      <w:r>
-        <w:t>` (no parameters) |</w:t>
-      </w:r>
-    </w:p>
-    <w:p>
-      <w:pPr>
-        <w:pStyle w:val="NoSpacing"/>
-      </w:pPr>
-      <w:r>
-        <w:t>| `Close-</w:t>
-      </w:r>
-      <w:proofErr w:type="spellStart"/>
-      <w:r>
-        <w:t>ADTSession</w:t>
-      </w:r>
-      <w:proofErr w:type="spellEnd"/>
-      <w:r>
-        <w:t xml:space="preserve"> -</w:t>
-      </w:r>
-      <w:proofErr w:type="spellStart"/>
-      <w:r>
-        <w:t>ErrorMessage</w:t>
-      </w:r>
-      <w:proofErr w:type="spellEnd"/>
-      <w:r>
-        <w:t>` | `Close-</w:t>
-      </w:r>
-      <w:proofErr w:type="spellStart"/>
-      <w:r>
-        <w:t>ADTSession</w:t>
-      </w:r>
-      <w:proofErr w:type="spellEnd"/>
-      <w:r>
-        <w:t>` (no parameters) |</w:t>
-      </w:r>
-    </w:p>
-    <w:p>
-      <w:pPr>
-        <w:pStyle w:val="NoSpacing"/>
-      </w:pPr>
-      <w:r>
-        <w:t>| `-</w:t>
-      </w:r>
-      <w:proofErr w:type="spellStart"/>
-      <w:r>
-        <w:t>CloseApps</w:t>
-      </w:r>
-      <w:proofErr w:type="spellEnd"/>
-      <w:r>
-        <w:t>` parameter | `-</w:t>
-      </w:r>
-      <w:proofErr w:type="spellStart"/>
-      <w:r>
-        <w:t>CloseProcesses</w:t>
-      </w:r>
-      <w:proofErr w:type="spellEnd"/>
-      <w:r>
-        <w:t>` parameter |</w:t>
-      </w:r>
-    </w:p>
-    <w:p>
-      <w:pPr>
-        <w:pStyle w:val="NoSpacing"/>
-      </w:pPr>
-      <w:r>
-        <w:t>| `-</w:t>
-      </w:r>
-      <w:proofErr w:type="spellStart"/>
-      <w:r>
-        <w:t>CloseAppsCountdown</w:t>
-      </w:r>
-      <w:proofErr w:type="spellEnd"/>
-      <w:r>
-        <w:t>` parameter | `-</w:t>
-      </w:r>
-      <w:proofErr w:type="spellStart"/>
-      <w:r>
-        <w:t>CloseProcessesCountdown</w:t>
-      </w:r>
-      <w:proofErr w:type="spellEnd"/>
-      <w:r>
-        <w:t>` parameter |</w:t>
-      </w:r>
-    </w:p>
-    <w:p>
-      <w:pPr>
-        <w:pStyle w:val="NoSpacing"/>
-      </w:pPr>
-      <w:r>
-        <w:t>| `-</w:t>
-      </w:r>
-      <w:proofErr w:type="spellStart"/>
-      <w:r>
-        <w:t>PersistPrompt</w:t>
-      </w:r>
-      <w:proofErr w:type="spellEnd"/>
-      <w:r>
-        <w:t>` with `-</w:t>
-      </w:r>
-      <w:proofErr w:type="spellStart"/>
-      <w:r>
-        <w:t>CloseProcesses</w:t>
-      </w:r>
-      <w:proofErr w:type="spellEnd"/>
-      <w:r>
-        <w:t>` | Remove - causes parameter set conflict |</w:t>
-      </w:r>
-    </w:p>
-    <w:p>
-      <w:pPr>
-        <w:pStyle w:val="NoSpacing"/>
-      </w:pPr>
-      <w:r>
-        <w:t>| `-</w:t>
-      </w:r>
-      <w:proofErr w:type="spellStart"/>
-      <w:r>
-        <w:t>BlockExecution</w:t>
-      </w:r>
-      <w:proofErr w:type="spellEnd"/>
-      <w:r>
-        <w:t>` with `-</w:t>
-      </w:r>
-      <w:proofErr w:type="spellStart"/>
-      <w:r>
-        <w:t>CloseProcesses</w:t>
-      </w:r>
-      <w:proofErr w:type="spellEnd"/>
-      <w:r>
-        <w:t>` | Remove - causes parameter set conflict |</w:t>
-      </w:r>
-    </w:p>
-    <w:p>
-      <w:pPr>
-        <w:pStyle w:val="NoSpacing"/>
-      </w:pPr>
-      <w:r>
-        <w:t>| `$</w:t>
-      </w:r>
-      <w:proofErr w:type="spellStart"/>
-      <w:r>
-        <w:t>ADTSession.FilesDirectory</w:t>
-      </w:r>
-      <w:proofErr w:type="spellEnd"/>
-      <w:r>
-        <w:t>` | `(Get-</w:t>
-      </w:r>
-      <w:proofErr w:type="spellStart"/>
-      <w:r>
-        <w:t>ADTSession</w:t>
-      </w:r>
-      <w:proofErr w:type="spellEnd"/>
-      <w:proofErr w:type="gramStart"/>
-      <w:r>
-        <w:t>).</w:t>
-      </w:r>
-      <w:proofErr w:type="spellStart"/>
-      <w:r>
-        <w:t>DirFiles</w:t>
-      </w:r>
-      <w:proofErr w:type="spellEnd"/>
-      <w:proofErr w:type="gramEnd"/>
-      <w:r>
-        <w:t>` |</w:t>
-      </w:r>
-    </w:p>
-    <w:p>
-      <w:pPr>
-        <w:pStyle w:val="NoSpacing"/>
-      </w:pPr>
-      <w:r>
-        <w:t>| `$</w:t>
-      </w:r>
-      <w:proofErr w:type="spellStart"/>
-      <w:r>
-        <w:t>ADTSession.DirFiles</w:t>
-      </w:r>
-      <w:proofErr w:type="spellEnd"/>
-      <w:r>
-        <w:t>` | `(Get-</w:t>
-      </w:r>
-      <w:proofErr w:type="spellStart"/>
-      <w:r>
-        <w:t>ADTSession</w:t>
-      </w:r>
-      <w:proofErr w:type="spellEnd"/>
-      <w:proofErr w:type="gramStart"/>
-      <w:r>
-        <w:t>).</w:t>
-      </w:r>
-      <w:proofErr w:type="spellStart"/>
-      <w:r>
-        <w:t>DirFiles</w:t>
-      </w:r>
-      <w:proofErr w:type="spellEnd"/>
-      <w:proofErr w:type="gramEnd"/>
-      <w:r>
-        <w:t>` |</w:t>
-      </w:r>
-    </w:p>
-    <w:p>
-      <w:pPr>
-        <w:pStyle w:val="NoSpacing"/>
-      </w:pPr>
-      <w:r>
-        <w:t>| `$</w:t>
-      </w:r>
-      <w:proofErr w:type="spellStart"/>
-      <w:proofErr w:type="gramStart"/>
-      <w:r>
-        <w:t>ADTSession</w:t>
-      </w:r>
-      <w:proofErr w:type="spellEnd"/>
-      <w:r>
-        <w:t>.&lt;</w:t>
-      </w:r>
-      <w:proofErr w:type="gramEnd"/>
-      <w:r>
-        <w:t>Property&gt;` | `(Get-</w:t>
-      </w:r>
-      <w:proofErr w:type="spellStart"/>
-      <w:r>
-        <w:t>ADTSession</w:t>
-      </w:r>
-      <w:proofErr w:type="spellEnd"/>
-      <w:proofErr w:type="gramStart"/>
-      <w:r>
-        <w:t>).&lt;</w:t>
-      </w:r>
-      <w:proofErr w:type="gramEnd"/>
-      <w:r>
-        <w:t>Property</w:t>
-      </w:r>
-      <w:proofErr w:type="gramStart"/>
-      <w:r>
-        <w:t>&gt;` |</w:t>
-      </w:r>
-      <w:proofErr w:type="gramEnd"/>
-    </w:p>
-    <w:p>
-      <w:pPr>
-        <w:pStyle w:val="NoSpacing"/>
-      </w:pPr>
-    </w:p>
-    <w:p>
-      <w:pPr>
-        <w:pStyle w:val="NoSpacing"/>
-      </w:pPr>
-      <w:r>
-        <w:t xml:space="preserve">**If you use any function from the "WRONG" column, the script will fail </w:t>
-      </w:r>
-      <w:proofErr w:type="gramStart"/>
-      <w:r>
-        <w:t>with:*</w:t>
-      </w:r>
-      <w:proofErr w:type="gramEnd"/>
-      <w:r>
-        <w:t>*</w:t>
+        <w:t>| `Initialize-ADTDeployment` | `Open-ADTSession` |</w:t>
+      </w:r>
+    </w:p>
+    <w:p>
+      <w:pPr>
+        <w:pStyle w:val="NoSpacing"/>
+      </w:pPr>
+      <w:r>
+        <w:t>| `Complete-ADTDeployment` | `Close-ADTSession` |</w:t>
+      </w:r>
+    </w:p>
+    <w:p>
+      <w:pPr>
+        <w:pStyle w:val="NoSpacing"/>
+      </w:pPr>
+      <w:r>
+        <w:t>| `Get-ADTInstalledApplication` | `Get-ADTApplication` |</w:t>
+      </w:r>
+    </w:p>
+    <w:p>
+      <w:pPr>
+        <w:pStyle w:val="NoSpacing"/>
+      </w:pPr>
+      <w:r>
+        <w:t>| `Execute-Process` | `Start-ADTProcess` |</w:t>
+      </w:r>
+    </w:p>
+    <w:p>
+      <w:pPr>
+        <w:pStyle w:val="NoSpacing"/>
+      </w:pPr>
+      <w:r>
+        <w:t>| `Execute-MSI` | `Start-ADTMsiProcess` |</w:t>
+      </w:r>
+    </w:p>
+    <w:p>
+      <w:pPr>
+        <w:pStyle w:val="NoSpacing"/>
+      </w:pPr>
+      <w:r>
+        <w:t>| `Show-InstallationWelcome` | `Show-ADTInstallationWelcome` |</w:t>
+      </w:r>
+    </w:p>
+    <w:p>
+      <w:pPr>
+        <w:pStyle w:val="NoSpacing"/>
+      </w:pPr>
+      <w:r>
+        <w:t>| `Show-InstallationProgress` | `Show-ADTInstallationProgress` |</w:t>
+      </w:r>
+    </w:p>
+    <w:p>
+      <w:pPr>
+        <w:pStyle w:val="NoSpacing"/>
+      </w:pPr>
+      <w:r>
+        <w:t>| `-Arguments` parameter | `-ArgumentList` parameter |</w:t>
+      </w:r>
+    </w:p>
+    <w:p>
+      <w:pPr>
+        <w:pStyle w:val="NoSpacing"/>
+      </w:pPr>
+      <w:r>
+        <w:t>| `Close-ADTSession -DeploymentStatus` | `Close-ADTSession` (no parameters) |</w:t>
+      </w:r>
+    </w:p>
+    <w:p>
+      <w:pPr>
+        <w:pStyle w:val="NoSpacing"/>
+      </w:pPr>
+      <w:r>
+        <w:t>| `Close-ADTSession -ErrorMessage` | `Close-ADTSession` (no parameters) |</w:t>
+      </w:r>
+    </w:p>
+    <w:p>
+      <w:pPr>
+        <w:pStyle w:val="NoSpacing"/>
+      </w:pPr>
+      <w:r>
+        <w:t>| `-CloseApps` parameter | `-CloseProcesses` parameter |</w:t>
+      </w:r>
+    </w:p>
+    <w:p>
+      <w:pPr>
+        <w:pStyle w:val="NoSpacing"/>
+      </w:pPr>
+      <w:r>
+        <w:t>| `-CloseAppsCountdown` parameter | `-CloseProcessesCountdown` parameter |</w:t>
+      </w:r>
+    </w:p>
+    <w:p>
+      <w:pPr>
+        <w:pStyle w:val="NoSpacing"/>
+      </w:pPr>
+      <w:r>
+        <w:t>| `-PersistPrompt` with `-CloseProcesses` | Remove - causes parameter set conflict |</w:t>
+      </w:r>
+    </w:p>
+    <w:p>
+      <w:pPr>
+        <w:pStyle w:val="NoSpacing"/>
+      </w:pPr>
+      <w:r>
+        <w:t>| `-BlockExecution` with `-CloseProcesses` | Remove - causes parameter set conflict |</w:t>
+      </w:r>
+    </w:p>
+    <w:p>
+      <w:pPr>
+        <w:pStyle w:val="NoSpacing"/>
+      </w:pPr>
+      <w:r>
+        <w:t>| `$ADTSession.FilesDirectory` | `(Get-ADTSession).DirFiles` |</w:t>
+      </w:r>
+    </w:p>
+    <w:p>
+      <w:pPr>
+        <w:pStyle w:val="NoSpacing"/>
+      </w:pPr>
+      <w:r>
+        <w:t>| `$ADTSession.DirFiles` | `(Get-ADTSession).DirFiles` |</w:t>
+      </w:r>
+    </w:p>
+    <w:p>
+      <w:pPr>
+        <w:pStyle w:val="NoSpacing"/>
+      </w:pPr>
+      <w:r>
+        <w:t>| `$ADTSession.&lt;Property&gt;` | `(Get-ADTSession).&lt;Property&gt;` |</w:t>
+      </w:r>
+    </w:p>
+    <w:p>
+      <w:pPr>
+        <w:pStyle w:val="NoSpacing"/>
+      </w:pPr>
+    </w:p>
+    <w:p>
+      <w:pPr>
+        <w:pStyle w:val="NoSpacing"/>
+      </w:pPr>
+      <w:r>
+        <w:t>**If you use any function from the "WRONG" column, the script will fail with:**</w:t>
       </w:r>
     </w:p>
     <w:p>
@@ -4095,15 +3467,7 @@
         <w:pStyle w:val="NoSpacing"/>
       </w:pPr>
       <w:r>
-        <w:t>The term 'Initialize-</w:t>
-      </w:r>
-      <w:proofErr w:type="spellStart"/>
-      <w:r>
-        <w:t>ADTDeployment</w:t>
-      </w:r>
-      <w:proofErr w:type="spellEnd"/>
-      <w:r>
-        <w:t>' is not recognized as the name of a cmdlet</w:t>
+        <w:t>The term 'Initialize-ADTDeployment' is not recognized as the name of a cmdlet</w:t>
       </w:r>
     </w:p>
     <w:p>
@@ -4119,23 +3483,7 @@
         <w:pStyle w:val="NoSpacing"/>
       </w:pPr>
       <w:r>
-        <w:t>**If you use invalid parameters on Close-</w:t>
-      </w:r>
-      <w:proofErr w:type="spellStart"/>
-      <w:r>
-        <w:t>ADTSession</w:t>
-      </w:r>
-      <w:proofErr w:type="spellEnd"/>
-      <w:r>
-        <w:t xml:space="preserve">, the script will fail </w:t>
-      </w:r>
-      <w:proofErr w:type="gramStart"/>
-      <w:r>
-        <w:t>with:*</w:t>
-      </w:r>
-      <w:proofErr w:type="gramEnd"/>
-      <w:r>
-        <w:t>*</w:t>
+        <w:t>**If you use invalid parameters on Close-ADTSession, the script will fail with:**</w:t>
       </w:r>
     </w:p>
     <w:p>
@@ -4151,15 +3499,7 @@
         <w:pStyle w:val="NoSpacing"/>
       </w:pPr>
       <w:r>
-        <w:t>A parameter cannot be found that matches parameter name '</w:t>
-      </w:r>
-      <w:proofErr w:type="spellStart"/>
-      <w:r>
-        <w:t>DeploymentStatus</w:t>
-      </w:r>
-      <w:proofErr w:type="spellEnd"/>
-      <w:r>
-        <w:t>'</w:t>
+        <w:t>A parameter cannot be found that matches parameter name 'DeploymentStatus'</w:t>
       </w:r>
     </w:p>
     <w:p>
@@ -4175,23 +3515,7 @@
         <w:pStyle w:val="NoSpacing"/>
       </w:pPr>
       <w:r>
-        <w:t>**If you use old parameter names on Show-</w:t>
-      </w:r>
-      <w:proofErr w:type="spellStart"/>
-      <w:r>
-        <w:t>ADTInstallationWelcome</w:t>
-      </w:r>
-      <w:proofErr w:type="spellEnd"/>
-      <w:r>
-        <w:t xml:space="preserve">, the script will fail </w:t>
-      </w:r>
-      <w:proofErr w:type="gramStart"/>
-      <w:r>
-        <w:t>with:*</w:t>
-      </w:r>
-      <w:proofErr w:type="gramEnd"/>
-      <w:r>
-        <w:t>*</w:t>
+        <w:t>**If you use old parameter names on Show-ADTInstallationWelcome, the script will fail with:**</w:t>
       </w:r>
     </w:p>
     <w:p>
@@ -4227,23 +3551,7 @@
       </w:pPr>
       <w:r>
         <w:lastRenderedPageBreak/>
-        <w:t>**If you use `$</w:t>
-      </w:r>
-      <w:proofErr w:type="spellStart"/>
-      <w:r>
-        <w:t>ADTSession</w:t>
-      </w:r>
-      <w:proofErr w:type="spellEnd"/>
-      <w:r>
-        <w:t xml:space="preserve">` variable directly, the script will fail </w:t>
-      </w:r>
-      <w:proofErr w:type="gramStart"/>
-      <w:r>
-        <w:t>with:*</w:t>
-      </w:r>
-      <w:proofErr w:type="gramEnd"/>
-      <w:r>
-        <w:t>*</w:t>
+        <w:t>**If you use `$ADTSession` variable directly, the script will fail with:**</w:t>
       </w:r>
     </w:p>
     <w:p>
@@ -4319,28 +3627,11 @@
         <w:t xml:space="preserve"> a toolbox.</w:t>
       </w:r>
       <w:r>
-        <w:t xml:space="preserve"> Right </w:t>
-      </w:r>
-      <w:proofErr w:type="gramStart"/>
-      <w:r>
-        <w:t>now</w:t>
-      </w:r>
-      <w:proofErr w:type="gramEnd"/>
-      <w:r>
-        <w:t xml:space="preserve"> </w:t>
-      </w:r>
-      <w:proofErr w:type="gramStart"/>
-      <w:r>
-        <w:t>its</w:t>
-      </w:r>
-      <w:proofErr w:type="gramEnd"/>
-      <w:r>
-        <w:t xml:space="preserve"> hard to keep up with all the start-ups and </w:t>
+        <w:t xml:space="preserve"> Right now its hard to keep up with all the start-ups and </w:t>
       </w:r>
       <w:r>
         <w:t xml:space="preserve">giants trying to carve up market share. News releases are </w:t>
       </w:r>
-      <w:proofErr w:type="gramStart"/>
       <w:r>
         <w:t>frantic</w:t>
       </w:r>
@@ -4350,7 +3641,6 @@
       <w:r>
         <w:t xml:space="preserve"> but</w:t>
       </w:r>
-      <w:proofErr w:type="gramEnd"/>
       <w:r>
         <w:t xml:space="preserve"> try to pilot and evaluate tools for your needs, and remember that things are still very early. For code generation, I see promise: most code isn’t interesting, so why not have assistants build it</w:t>
       </w:r>

</xml_diff>